<commit_message>
docs+build(phase3): PHASE3_EXCEL_FEATURES.md, ARCHITECTURE section 11, spec bundling
- Bundle excel_export_enhanced.py, export_manager.py, templates/*.xlsx and
  page 6 in LabScheduling.spec (datas + hiddenimports).
- ARCHITECTURE.md section 11; PHASE3_EXCEL_FEATURES.md.
</commit_message>
<xml_diff>
--- a/docs/ARCHITECTURE.docx
+++ b/docs/ARCHITECTURE.docx
@@ -2,7 +2,7 @@
 <file path=word/document.xml><?xml version="1.0" encoding="utf-8"?>
 <w:document xmlns:w="http://schemas.openxmlformats.org/wordprocessingml/2006/main" xmlns:m="http://schemas.openxmlformats.org/officeDocument/2006/math" xmlns:r="http://schemas.openxmlformats.org/officeDocument/2006/relationships" xmlns:o="urn:schemas-microsoft-com:office:office" xmlns:v="urn:schemas-microsoft-com:vml" xmlns:w10="urn:schemas-microsoft-com:office:word" xmlns:a="http://schemas.openxmlformats.org/drawingml/2006/main" xmlns:pic="http://schemas.openxmlformats.org/drawingml/2006/picture" xmlns:wp="http://schemas.openxmlformats.org/drawingml/2006/wordprocessingDrawing">
   <w:body>
-    <w:bookmarkStart w:id="40" w:name="Xbf53dc2f090b93d7de4443a3902cf89d97098c4"/>
+    <w:bookmarkStart w:id="46" w:name="Xbf53dc2f090b93d7de4443a3902cf89d97098c4"/>
     <w:p>
       <w:pPr>
         <w:pStyle w:val="Heading1"/>
@@ -5582,7 +5582,1093 @@
     </w:p>
     <w:bookmarkEnd w:id="38"/>
     <w:bookmarkEnd w:id="39"/>
+    <w:bookmarkStart w:id="45" w:name="Xe48244f90a6d98f173ed45b944fafb2d0bfdad6"/>
+    <w:p>
+      <w:pPr>
+        <w:pStyle w:val="Heading2"/>
+      </w:pPr>
+      <w:r>
+        <w:t xml:space="preserve">11. Phase 3 components (enhanced Excel exports)</w:t>
+      </w:r>
+    </w:p>
+    <w:p>
+      <w:pPr>
+        <w:pStyle w:val="FirstParagraph"/>
+      </w:pPr>
+      <w:r>
+        <w:t xml:space="preserve">Phase 3 adds a richer, analysis-oriented Excel export layer. It is</w:t>
+      </w:r>
+      <w:r>
+        <w:t xml:space="preserve"> </w:t>
+      </w:r>
+      <w:r>
+        <w:rPr>
+          <w:bCs/>
+          <w:b/>
+        </w:rPr>
+        <w:t xml:space="preserve">purely</w:t>
+      </w:r>
+      <w:r>
+        <w:rPr>
+          <w:bCs/>
+          <w:b/>
+        </w:rPr>
+        <w:t xml:space="preserve"> </w:t>
+      </w:r>
+      <w:r>
+        <w:rPr>
+          <w:bCs/>
+          <w:b/>
+        </w:rPr>
+        <w:t xml:space="preserve">additive</w:t>
+      </w:r>
+      <w:r>
+        <w:t xml:space="preserve">: the validated Daniel-format exporters (</w:t>
+      </w:r>
+      <w:r>
+        <w:rPr>
+          <w:rStyle w:val="VerbatimChar"/>
+        </w:rPr>
+        <w:t xml:space="preserve">excel_export.py</w:t>
+      </w:r>
+      <w:r>
+        <w:t xml:space="preserve"> </w:t>
+      </w:r>
+      <w:r>
+        <w:t xml:space="preserve">+</w:t>
+      </w:r>
+      <w:r>
+        <w:t xml:space="preserve"> </w:t>
+      </w:r>
+      <w:r>
+        <w:rPr>
+          <w:rStyle w:val="VerbatimChar"/>
+        </w:rPr>
+        <w:t xml:space="preserve">excel_generator_core.py</w:t>
+      </w:r>
+      <w:r>
+        <w:t xml:space="preserve">) are never modified, and the</w:t>
+      </w:r>
+      <w:r>
+        <w:t xml:space="preserve"> </w:t>
+      </w:r>
+      <w:r>
+        <w:rPr>
+          <w:rStyle w:val="VerbatimChar"/>
+        </w:rPr>
+        <w:t xml:space="preserve">standard</w:t>
+      </w:r>
+      <w:r>
+        <w:t xml:space="preserve"> </w:t>
+      </w:r>
+      <w:r>
+        <w:t xml:space="preserve">format simply</w:t>
+      </w:r>
+      <w:r>
+        <w:t xml:space="preserve"> </w:t>
+      </w:r>
+      <w:r>
+        <w:t xml:space="preserve">delegates to them, so existing deliverables stay byte-for-byte identical.</w:t>
+      </w:r>
+    </w:p>
+    <w:bookmarkStart w:id="40" w:name="module-map"/>
+    <w:p>
+      <w:pPr>
+        <w:pStyle w:val="Heading3"/>
+      </w:pPr>
+      <w:r>
+        <w:t xml:space="preserve">11.1 Module map</w:t>
+      </w:r>
+    </w:p>
+    <w:tbl>
+      <w:tblPr>
+        <w:tblStyle w:val="Table"/>
+        <w:tblW w:type="pct" w:w="5000"/>
+        <w:tblLook w:firstRow="1" w:lastRow="0" w:firstColumn="0" w:lastColumn="0" w:noHBand="0" w:noVBand="0" w:val="0020"/>
+      </w:tblPr>
+      <w:tblGrid>
+        <w:gridCol w:w="2917"/>
+        <w:gridCol w:w="2501"/>
+        <w:gridCol w:w="2501"/>
+      </w:tblGrid>
+      <w:tr>
+        <w:trPr>
+          <w:tblHeader w:val="true"/>
+        </w:trPr>
+        <w:tc>
+          <w:tcPr/>
+          <w:p>
+            <w:pPr>
+              <w:pStyle w:val="Compact"/>
+              <w:jc w:val="left"/>
+            </w:pPr>
+            <w:r>
+              <w:t xml:space="preserve">Piece</w:t>
+            </w:r>
+          </w:p>
+        </w:tc>
+        <w:tc>
+          <w:tcPr/>
+          <w:p>
+            <w:pPr>
+              <w:pStyle w:val="Compact"/>
+              <w:jc w:val="left"/>
+            </w:pPr>
+            <w:r>
+              <w:t xml:space="preserve">File</w:t>
+            </w:r>
+          </w:p>
+        </w:tc>
+        <w:tc>
+          <w:tcPr/>
+          <w:p>
+            <w:pPr>
+              <w:pStyle w:val="Compact"/>
+              <w:jc w:val="left"/>
+            </w:pPr>
+            <w:r>
+              <w:t xml:space="preserve">Role</w:t>
+            </w:r>
+          </w:p>
+        </w:tc>
+      </w:tr>
+      <w:tr>
+        <w:tc>
+          <w:tcPr/>
+          <w:p>
+            <w:pPr>
+              <w:pStyle w:val="Compact"/>
+              <w:jc w:val="left"/>
+            </w:pPr>
+            <w:r>
+              <w:t xml:space="preserve">Enhanced engine</w:t>
+            </w:r>
+          </w:p>
+        </w:tc>
+        <w:tc>
+          <w:tcPr/>
+          <w:p>
+            <w:pPr>
+              <w:pStyle w:val="Compact"/>
+              <w:jc w:val="left"/>
+            </w:pPr>
+            <w:r>
+              <w:rPr>
+                <w:rStyle w:val="VerbatimChar"/>
+              </w:rPr>
+              <w:t xml:space="preserve">excel_export_enhanced.py</w:t>
+            </w:r>
+          </w:p>
+        </w:tc>
+        <w:tc>
+          <w:tcPr/>
+          <w:p>
+            <w:pPr>
+              <w:pStyle w:val="Compact"/>
+              <w:jc w:val="left"/>
+            </w:pPr>
+            <w:r>
+              <w:t xml:space="preserve">Builds colour-coded group sheets, a legend, and five analysis sheets (Room Utilization, Professor Workload, Student Placement, Time Slot Analysis, Quality Metrics). Owns all styling helpers (branded headers, alternating rows, conditional formatting, charts, comments, freeze panes, auto-filters, data validation, named ranges).</w:t>
+            </w:r>
+          </w:p>
+        </w:tc>
+      </w:tr>
+      <w:tr>
+        <w:tc>
+          <w:tcPr/>
+          <w:p>
+            <w:pPr>
+              <w:pStyle w:val="Compact"/>
+              <w:jc w:val="left"/>
+            </w:pPr>
+            <w:r>
+              <w:t xml:space="preserve">Format &amp; template manager</w:t>
+            </w:r>
+          </w:p>
+        </w:tc>
+        <w:tc>
+          <w:tcPr/>
+          <w:p>
+            <w:pPr>
+              <w:pStyle w:val="Compact"/>
+              <w:jc w:val="left"/>
+            </w:pPr>
+            <w:r>
+              <w:rPr>
+                <w:rStyle w:val="VerbatimChar"/>
+              </w:rPr>
+              <w:t xml:space="preserve">export_manager.py</w:t>
+            </w:r>
+          </w:p>
+        </w:tc>
+        <w:tc>
+          <w:tcPr/>
+          <w:p>
+            <w:pPr>
+              <w:pStyle w:val="Compact"/>
+              <w:jc w:val="left"/>
+            </w:pPr>
+            <w:r>
+              <w:t xml:space="preserve">Maps a</w:t>
+            </w:r>
+            <w:r>
+              <w:t xml:space="preserve"> </w:t>
+            </w:r>
+            <w:r>
+              <w:rPr>
+                <w:rStyle w:val="VerbatimChar"/>
+              </w:rPr>
+              <w:t xml:space="preserve">format_type</w:t>
+            </w:r>
+            <w:r>
+              <w:t xml:space="preserve"> </w:t>
+            </w:r>
+            <w:r>
+              <w:t xml:space="preserve">(</w:t>
+            </w:r>
+            <w:r>
+              <w:rPr>
+                <w:rStyle w:val="VerbatimChar"/>
+              </w:rPr>
+              <w:t xml:space="preserve">standard</w:t>
+            </w:r>
+            <w:r>
+              <w:t xml:space="preserve"> </w:t>
+            </w:r>
+            <w:r>
+              <w:t xml:space="preserve">/</w:t>
+            </w:r>
+            <w:r>
+              <w:t xml:space="preserve"> </w:t>
+            </w:r>
+            <w:r>
+              <w:rPr>
+                <w:rStyle w:val="VerbatimChar"/>
+              </w:rPr>
+              <w:t xml:space="preserve">enhanced</w:t>
+            </w:r>
+            <w:r>
+              <w:t xml:space="preserve"> </w:t>
+            </w:r>
+            <w:r>
+              <w:t xml:space="preserve">/</w:t>
+            </w:r>
+            <w:r>
+              <w:t xml:space="preserve"> </w:t>
+            </w:r>
+            <w:r>
+              <w:rPr>
+                <w:rStyle w:val="VerbatimChar"/>
+              </w:rPr>
+              <w:t xml:space="preserve">summary</w:t>
+            </w:r>
+            <w:r>
+              <w:t xml:space="preserve"> </w:t>
+            </w:r>
+            <w:r>
+              <w:t xml:space="preserve">/</w:t>
+            </w:r>
+            <w:r>
+              <w:t xml:space="preserve"> </w:t>
+            </w:r>
+            <w:r>
+              <w:rPr>
+                <w:rStyle w:val="VerbatimChar"/>
+              </w:rPr>
+              <w:t xml:space="preserve">detailed</w:t>
+            </w:r>
+            <w:r>
+              <w:t xml:space="preserve">) to an</w:t>
+            </w:r>
+            <w:r>
+              <w:t xml:space="preserve"> </w:t>
+            </w:r>
+            <w:r>
+              <w:rPr>
+                <w:rStyle w:val="VerbatimChar"/>
+              </w:rPr>
+              <w:t xml:space="preserve">ExportOptions</w:t>
+            </w:r>
+            <w:r>
+              <w:t xml:space="preserve"> </w:t>
+            </w:r>
+            <w:r>
+              <w:t xml:space="preserve">profile; loads</w:t>
+            </w:r>
+            <w:r>
+              <w:t xml:space="preserve"> </w:t>
+            </w:r>
+            <w:r>
+              <w:rPr>
+                <w:rStyle w:val="VerbatimChar"/>
+              </w:rPr>
+              <w:t xml:space="preserve">config/export_preferences.yaml</w:t>
+            </w:r>
+            <w:r>
+              <w:t xml:space="preserve">; and implements the template engine (discover / validate / render</w:t>
+            </w:r>
+            <w:r>
+              <w:t xml:space="preserve"> </w:t>
+            </w:r>
+            <w:r>
+              <w:rPr>
+                <w:rStyle w:val="VerbatimChar"/>
+              </w:rPr>
+              <w:t xml:space="preserve">{{TOKEN}}</w:t>
+            </w:r>
+            <w:r>
+              <w:t xml:space="preserve"> </w:t>
+            </w:r>
+            <w:r>
+              <w:t xml:space="preserve">placeholders).</w:t>
+            </w:r>
+          </w:p>
+        </w:tc>
+      </w:tr>
+      <w:tr>
+        <w:tc>
+          <w:tcPr/>
+          <w:p>
+            <w:pPr>
+              <w:pStyle w:val="Compact"/>
+              <w:jc w:val="left"/>
+            </w:pPr>
+            <w:r>
+              <w:t xml:space="preserve">Preferences</w:t>
+            </w:r>
+          </w:p>
+        </w:tc>
+        <w:tc>
+          <w:tcPr/>
+          <w:p>
+            <w:pPr>
+              <w:pStyle w:val="Compact"/>
+              <w:jc w:val="left"/>
+            </w:pPr>
+            <w:r>
+              <w:rPr>
+                <w:rStyle w:val="VerbatimChar"/>
+              </w:rPr>
+              <w:t xml:space="preserve">config/export_preferences.yaml</w:t>
+            </w:r>
+          </w:p>
+        </w:tc>
+        <w:tc>
+          <w:tcPr/>
+          <w:p>
+            <w:pPr>
+              <w:pStyle w:val="Compact"/>
+              <w:jc w:val="left"/>
+            </w:pPr>
+            <w:r>
+              <w:t xml:space="preserve">Default format, default colour scheme, per-format flag overrides, templates directory. Missing/invalid -&gt; built-in defaults.</w:t>
+            </w:r>
+          </w:p>
+        </w:tc>
+      </w:tr>
+      <w:tr>
+        <w:tc>
+          <w:tcPr/>
+          <w:p>
+            <w:pPr>
+              <w:pStyle w:val="Compact"/>
+              <w:jc w:val="left"/>
+            </w:pPr>
+            <w:r>
+              <w:t xml:space="preserve">Templates</w:t>
+            </w:r>
+          </w:p>
+        </w:tc>
+        <w:tc>
+          <w:tcPr/>
+          <w:p>
+            <w:pPr>
+              <w:pStyle w:val="Compact"/>
+              <w:jc w:val="left"/>
+            </w:pPr>
+            <w:r>
+              <w:rPr>
+                <w:rStyle w:val="VerbatimChar"/>
+              </w:rPr>
+              <w:t xml:space="preserve">templates/*.xlsx</w:t>
+            </w:r>
+          </w:p>
+        </w:tc>
+        <w:tc>
+          <w:tcPr/>
+          <w:p>
+            <w:pPr>
+              <w:pStyle w:val="Compact"/>
+              <w:jc w:val="left"/>
+            </w:pPr>
+            <w:r>
+              <w:t xml:space="preserve">Branded workbooks with</w:t>
+            </w:r>
+            <w:r>
+              <w:t xml:space="preserve"> </w:t>
+            </w:r>
+            <w:r>
+              <w:rPr>
+                <w:rStyle w:val="VerbatimChar"/>
+              </w:rPr>
+              <w:t xml:space="preserve">{{TOKEN}}</w:t>
+            </w:r>
+            <w:r>
+              <w:t xml:space="preserve"> </w:t>
+            </w:r>
+            <w:r>
+              <w:t xml:space="preserve">placeholders.</w:t>
+            </w:r>
+            <w:r>
+              <w:t xml:space="preserve"> </w:t>
+            </w:r>
+            <w:r>
+              <w:rPr>
+                <w:rStyle w:val="VerbatimChar"/>
+              </w:rPr>
+              <w:t xml:space="preserve">loyola_schedule_template.xlsx</w:t>
+            </w:r>
+            <w:r>
+              <w:t xml:space="preserve"> </w:t>
+            </w:r>
+            <w:r>
+              <w:t xml:space="preserve">ships by default;</w:t>
+            </w:r>
+            <w:r>
+              <w:t xml:space="preserve"> </w:t>
+            </w:r>
+            <w:r>
+              <w:rPr>
+                <w:rStyle w:val="VerbatimChar"/>
+              </w:rPr>
+              <w:t xml:space="preserve">templates/build_loyola_template.py</w:t>
+            </w:r>
+            <w:r>
+              <w:t xml:space="preserve"> </w:t>
+            </w:r>
+            <w:r>
+              <w:t xml:space="preserve">regenerates it deterministically.</w:t>
+            </w:r>
+          </w:p>
+        </w:tc>
+      </w:tr>
+      <w:tr>
+        <w:tc>
+          <w:tcPr/>
+          <w:p>
+            <w:pPr>
+              <w:pStyle w:val="Compact"/>
+              <w:jc w:val="left"/>
+            </w:pPr>
+            <w:r>
+              <w:t xml:space="preserve">UI</w:t>
+            </w:r>
+          </w:p>
+        </w:tc>
+        <w:tc>
+          <w:tcPr/>
+          <w:p>
+            <w:pPr>
+              <w:pStyle w:val="Compact"/>
+              <w:jc w:val="left"/>
+            </w:pPr>
+            <w:r>
+              <w:rPr>
+                <w:rStyle w:val="VerbatimChar"/>
+              </w:rPr>
+              <w:t xml:space="preserve">pages/6_Exports_Avancés.py</w:t>
+            </w:r>
+          </w:p>
+        </w:tc>
+        <w:tc>
+          <w:tcPr/>
+          <w:p>
+            <w:pPr>
+              <w:pStyle w:val="Compact"/>
+              <w:jc w:val="left"/>
+            </w:pPr>
+            <w:r>
+              <w:t xml:space="preserve">Read-only export console: perimeter/format/colour-scheme selectors, per-sheet and per-formatting checkboxes, data preview, generate + download, and a template renderer.</w:t>
+            </w:r>
+          </w:p>
+        </w:tc>
+      </w:tr>
+    </w:tbl>
     <w:bookmarkEnd w:id="40"/>
+    <w:bookmarkStart w:id="41" w:name="formats"/>
+    <w:p>
+      <w:pPr>
+        <w:pStyle w:val="Heading3"/>
+      </w:pPr>
+      <w:r>
+        <w:t xml:space="preserve">11.2 Formats</w:t>
+      </w:r>
+    </w:p>
+    <w:tbl>
+      <w:tblPr>
+        <w:tblStyle w:val="Table"/>
+        <w:tblW w:type="pct" w:w="5000"/>
+        <w:tblLook w:firstRow="1" w:lastRow="0" w:firstColumn="0" w:lastColumn="0" w:noHBand="0" w:noVBand="0" w:val="0020"/>
+      </w:tblPr>
+      <w:tblGrid>
+        <w:gridCol w:w="2534"/>
+        <w:gridCol w:w="2534"/>
+        <w:gridCol w:w="2851"/>
+      </w:tblGrid>
+      <w:tr>
+        <w:trPr>
+          <w:tblHeader w:val="true"/>
+        </w:trPr>
+        <w:tc>
+          <w:tcPr/>
+          <w:p>
+            <w:pPr>
+              <w:pStyle w:val="Compact"/>
+              <w:jc w:val="left"/>
+            </w:pPr>
+            <w:r>
+              <w:t xml:space="preserve">Format</w:t>
+            </w:r>
+          </w:p>
+        </w:tc>
+        <w:tc>
+          <w:tcPr/>
+          <w:p>
+            <w:pPr>
+              <w:pStyle w:val="Compact"/>
+              <w:jc w:val="left"/>
+            </w:pPr>
+            <w:r>
+              <w:t xml:space="preserve">Sheets</w:t>
+            </w:r>
+          </w:p>
+        </w:tc>
+        <w:tc>
+          <w:tcPr/>
+          <w:p>
+            <w:pPr>
+              <w:pStyle w:val="Compact"/>
+              <w:jc w:val="left"/>
+            </w:pPr>
+            <w:r>
+              <w:t xml:space="preserve">Notable</w:t>
+            </w:r>
+          </w:p>
+        </w:tc>
+      </w:tr>
+      <w:tr>
+        <w:tc>
+          <w:tcPr/>
+          <w:p>
+            <w:pPr>
+              <w:pStyle w:val="Compact"/>
+              <w:jc w:val="left"/>
+            </w:pPr>
+            <w:r>
+              <w:rPr>
+                <w:rStyle w:val="VerbatimChar"/>
+              </w:rPr>
+              <w:t xml:space="preserve">standard</w:t>
+            </w:r>
+          </w:p>
+        </w:tc>
+        <w:tc>
+          <w:tcPr/>
+          <w:p>
+            <w:pPr>
+              <w:pStyle w:val="Compact"/>
+              <w:jc w:val="left"/>
+            </w:pPr>
+            <w:r>
+              <w:t xml:space="preserve">(delegates to</w:t>
+            </w:r>
+            <w:r>
+              <w:t xml:space="preserve"> </w:t>
+            </w:r>
+            <w:r>
+              <w:rPr>
+                <w:rStyle w:val="VerbatimChar"/>
+              </w:rPr>
+              <w:t xml:space="preserve">excel_export</w:t>
+            </w:r>
+            <w:r>
+              <w:t xml:space="preserve">)</w:t>
+            </w:r>
+          </w:p>
+        </w:tc>
+        <w:tc>
+          <w:tcPr/>
+          <w:p>
+            <w:pPr>
+              <w:pStyle w:val="Compact"/>
+              <w:jc w:val="left"/>
+            </w:pPr>
+            <w:r>
+              <w:t xml:space="preserve">Daniel-format workbooks, unchanged.</w:t>
+            </w:r>
+          </w:p>
+        </w:tc>
+      </w:tr>
+      <w:tr>
+        <w:tc>
+          <w:tcPr/>
+          <w:p>
+            <w:pPr>
+              <w:pStyle w:val="Compact"/>
+              <w:jc w:val="left"/>
+            </w:pPr>
+            <w:r>
+              <w:rPr>
+                <w:rStyle w:val="VerbatimChar"/>
+              </w:rPr>
+              <w:t xml:space="preserve">summary</w:t>
+            </w:r>
+          </w:p>
+        </w:tc>
+        <w:tc>
+          <w:tcPr/>
+          <w:p>
+            <w:pPr>
+              <w:pStyle w:val="Compact"/>
+              <w:jc w:val="left"/>
+            </w:pPr>
+            <w:r>
+              <w:t xml:space="preserve">Overview, Groups, Legend, Student Placement, Quality Metrics</w:t>
+            </w:r>
+          </w:p>
+        </w:tc>
+        <w:tc>
+          <w:tcPr/>
+          <w:p>
+            <w:pPr>
+              <w:pStyle w:val="Compact"/>
+              <w:jc w:val="left"/>
+            </w:pPr>
+            <w:r>
+              <w:t xml:space="preserve">Lightweight overview.</w:t>
+            </w:r>
+          </w:p>
+        </w:tc>
+      </w:tr>
+      <w:tr>
+        <w:tc>
+          <w:tcPr/>
+          <w:p>
+            <w:pPr>
+              <w:pStyle w:val="Compact"/>
+              <w:jc w:val="left"/>
+            </w:pPr>
+            <w:r>
+              <w:rPr>
+                <w:rStyle w:val="VerbatimChar"/>
+              </w:rPr>
+              <w:t xml:space="preserve">enhanced</w:t>
+            </w:r>
+          </w:p>
+        </w:tc>
+        <w:tc>
+          <w:tcPr/>
+          <w:p>
+            <w:pPr>
+              <w:pStyle w:val="Compact"/>
+              <w:jc w:val="left"/>
+            </w:pPr>
+            <w:r>
+              <w:t xml:space="preserve">All sheets</w:t>
+            </w:r>
+          </w:p>
+        </w:tc>
+        <w:tc>
+          <w:tcPr/>
+          <w:p>
+            <w:pPr>
+              <w:pStyle w:val="Compact"/>
+              <w:jc w:val="left"/>
+            </w:pPr>
+            <w:r>
+              <w:t xml:space="preserve">Full analysis with charts, comments, validation, named ranges.</w:t>
+            </w:r>
+          </w:p>
+        </w:tc>
+      </w:tr>
+      <w:tr>
+        <w:tc>
+          <w:tcPr/>
+          <w:p>
+            <w:pPr>
+              <w:pStyle w:val="Compact"/>
+              <w:jc w:val="left"/>
+            </w:pPr>
+            <w:r>
+              <w:rPr>
+                <w:rStyle w:val="VerbatimChar"/>
+              </w:rPr>
+              <w:t xml:space="preserve">detailed</w:t>
+            </w:r>
+          </w:p>
+        </w:tc>
+        <w:tc>
+          <w:tcPr/>
+          <w:p>
+            <w:pPr>
+              <w:pStyle w:val="Compact"/>
+              <w:jc w:val="left"/>
+            </w:pPr>
+            <w:r>
+              <w:t xml:space="preserve">All sheets</w:t>
+            </w:r>
+          </w:p>
+        </w:tc>
+        <w:tc>
+          <w:tcPr/>
+          <w:p>
+            <w:pPr>
+              <w:pStyle w:val="Compact"/>
+              <w:jc w:val="left"/>
+            </w:pPr>
+            <w:r>
+              <w:t xml:space="preserve">Same as enhanced but sheets are protected (filters stay usable).</w:t>
+            </w:r>
+          </w:p>
+        </w:tc>
+      </w:tr>
+    </w:tbl>
+    <w:bookmarkEnd w:id="41"/>
+    <w:bookmarkStart w:id="42" w:name="group-sizing-thresholds-status-semantics"/>
+    <w:p>
+      <w:pPr>
+        <w:pStyle w:val="Heading3"/>
+      </w:pPr>
+      <w:r>
+        <w:t xml:space="preserve">11.3 Group sizing thresholds (status semantics)</w:t>
+      </w:r>
+    </w:p>
+    <w:p>
+      <w:pPr>
+        <w:pStyle w:val="FirstParagraph"/>
+      </w:pPr>
+      <w:r>
+        <w:t xml:space="preserve">Mirror</w:t>
+      </w:r>
+      <w:r>
+        <w:t xml:space="preserve"> </w:t>
+      </w:r>
+      <w:r>
+        <w:rPr>
+          <w:rStyle w:val="VerbatimChar"/>
+        </w:rPr>
+        <w:t xml:space="preserve">pipeline.py</w:t>
+      </w:r>
+      <w:r>
+        <w:t xml:space="preserve">:</w:t>
+      </w:r>
+      <w:r>
+        <w:t xml:space="preserve"> </w:t>
+      </w:r>
+      <w:r>
+        <w:rPr>
+          <w:rStyle w:val="VerbatimChar"/>
+        </w:rPr>
+        <w:t xml:space="preserve">MIN_GROUP_SIZE = 7</w:t>
+      </w:r>
+      <w:r>
+        <w:t xml:space="preserve">,</w:t>
+      </w:r>
+      <w:r>
+        <w:t xml:space="preserve"> </w:t>
+      </w:r>
+      <w:r>
+        <w:rPr>
+          <w:rStyle w:val="VerbatimChar"/>
+        </w:rPr>
+        <w:t xml:space="preserve">PREFERRED_GROUP_SIZE = 12</w:t>
+      </w:r>
+      <w:r>
+        <w:t xml:space="preserve">,</w:t>
+      </w:r>
+      <w:r>
+        <w:t xml:space="preserve"> </w:t>
+      </w:r>
+      <w:r>
+        <w:rPr>
+          <w:rStyle w:val="VerbatimChar"/>
+        </w:rPr>
+        <w:t xml:space="preserve">MAX_GROUP_SIZE = 15</w:t>
+      </w:r>
+      <w:r>
+        <w:t xml:space="preserve">. A group is</w:t>
+      </w:r>
+      <w:r>
+        <w:t xml:space="preserve"> </w:t>
+      </w:r>
+      <w:r>
+        <w:rPr>
+          <w:bCs/>
+          <w:b/>
+        </w:rPr>
+        <w:t xml:space="preserve">optimal</w:t>
+      </w:r>
+      <w:r>
+        <w:t xml:space="preserve"> </w:t>
+      </w:r>
+      <w:r>
+        <w:t xml:space="preserve">when</w:t>
+      </w:r>
+      <w:r>
+        <w:t xml:space="preserve"> </w:t>
+      </w:r>
+      <w:r>
+        <w:rPr>
+          <w:rStyle w:val="VerbatimChar"/>
+        </w:rPr>
+        <w:t xml:space="preserve">7 &lt;= size &lt;= 15</w:t>
+      </w:r>
+      <w:r>
+        <w:t xml:space="preserve">,</w:t>
+      </w:r>
+      <w:r>
+        <w:t xml:space="preserve"> </w:t>
+      </w:r>
+      <w:r>
+        <w:rPr>
+          <w:bCs/>
+          <w:b/>
+        </w:rPr>
+        <w:t xml:space="preserve">under-utilized</w:t>
+      </w:r>
+      <w:r>
+        <w:t xml:space="preserve"> </w:t>
+      </w:r>
+      <w:r>
+        <w:t xml:space="preserve">below 7,</w:t>
+      </w:r>
+      <w:r>
+        <w:t xml:space="preserve"> </w:t>
+      </w:r>
+      <w:r>
+        <w:rPr>
+          <w:bCs/>
+          <w:b/>
+        </w:rPr>
+        <w:t xml:space="preserve">over-subscribed</w:t>
+      </w:r>
+      <w:r>
+        <w:t xml:space="preserve"> </w:t>
+      </w:r>
+      <w:r>
+        <w:t xml:space="preserve">above 15. Conditional</w:t>
+      </w:r>
+      <w:r>
+        <w:t xml:space="preserve"> </w:t>
+      </w:r>
+      <w:r>
+        <w:t xml:space="preserve">formatting and the status column both apply this rule.</w:t>
+      </w:r>
+    </w:p>
+    <w:bookmarkEnd w:id="42"/>
+    <w:bookmarkStart w:id="43" w:name="accessibility"/>
+    <w:p>
+      <w:pPr>
+        <w:pStyle w:val="Heading3"/>
+      </w:pPr>
+      <w:r>
+        <w:t xml:space="preserve">11.4 Accessibility</w:t>
+      </w:r>
+    </w:p>
+    <w:p>
+      <w:pPr>
+        <w:pStyle w:val="FirstParagraph"/>
+      </w:pPr>
+      <w:r>
+        <w:t xml:space="preserve">Status colours use a colour-blind-safe (Okabe-Ito derived) palette — optimal</w:t>
+      </w:r>
+      <w:r>
+        <w:t xml:space="preserve"> </w:t>
+      </w:r>
+      <w:r>
+        <w:rPr>
+          <w:rStyle w:val="VerbatimChar"/>
+        </w:rPr>
+        <w:t xml:space="preserve">#009E73</w:t>
+      </w:r>
+      <w:r>
+        <w:t xml:space="preserve"> </w:t>
+      </w:r>
+      <w:r>
+        <w:t xml:space="preserve">(bluish green), under-utilized</w:t>
+      </w:r>
+      <w:r>
+        <w:t xml:space="preserve"> </w:t>
+      </w:r>
+      <w:r>
+        <w:rPr>
+          <w:rStyle w:val="VerbatimChar"/>
+        </w:rPr>
+        <w:t xml:space="preserve">#E69F00</w:t>
+      </w:r>
+      <w:r>
+        <w:t xml:space="preserve"> </w:t>
+      </w:r>
+      <w:r>
+        <w:t xml:space="preserve">(orange), over-subscribed</w:t>
+      </w:r>
+      <w:r>
+        <w:t xml:space="preserve"> </w:t>
+      </w:r>
+      <w:r>
+        <w:rPr>
+          <w:rStyle w:val="VerbatimChar"/>
+        </w:rPr>
+        <w:t xml:space="preserve">#D55E00</w:t>
+      </w:r>
+      <w:r>
+        <w:t xml:space="preserve"> </w:t>
+      </w:r>
+      <w:r>
+        <w:t xml:space="preserve">(vermillion). Status is additionally encoded with a text label and a</w:t>
+      </w:r>
+      <w:r>
+        <w:t xml:space="preserve"> </w:t>
+      </w:r>
+      <w:r>
+        <w:t xml:space="preserve">fill</w:t>
+      </w:r>
+      <w:r>
+        <w:t xml:space="preserve"> </w:t>
+      </w:r>
+      <w:r>
+        <w:rPr>
+          <w:iCs/>
+          <w:i/>
+        </w:rPr>
+        <w:t xml:space="preserve">pattern</w:t>
+      </w:r>
+      <w:r>
+        <w:t xml:space="preserve">, so meaning never relies on colour alone. Per-group colours use</w:t>
+      </w:r>
+      <w:r>
+        <w:t xml:space="preserve"> </w:t>
+      </w:r>
+      <w:r>
+        <w:t xml:space="preserve">the qualitative Okabe-Ito set, extended deterministically via HSL for large</w:t>
+      </w:r>
+      <w:r>
+        <w:t xml:space="preserve"> </w:t>
+      </w:r>
+      <w:r>
+        <w:t xml:space="preserve">group counts so a group’s colour is stable across every sheet.</w:t>
+      </w:r>
+    </w:p>
+    <w:bookmarkEnd w:id="43"/>
+    <w:bookmarkStart w:id="44" w:name="public-api"/>
+    <w:p>
+      <w:pPr>
+        <w:pStyle w:val="Heading3"/>
+      </w:pPr>
+      <w:r>
+        <w:t xml:space="preserve">11.5 Public API</w:t>
+      </w:r>
+    </w:p>
+    <w:p>
+      <w:pPr>
+        <w:numPr>
+          <w:ilvl w:val="0"/>
+          <w:numId w:val="1005"/>
+        </w:numPr>
+        <w:pStyle w:val="Compact"/>
+      </w:pPr>
+      <w:r>
+        <w:rPr>
+          <w:rStyle w:val="VerbatimChar"/>
+        </w:rPr>
+        <w:t xml:space="preserve">export_manager.export_with_format(format_type, *, semester=None, out_path=None, color_scheme=None, overrides=None)</w:t>
+      </w:r>
+    </w:p>
+    <w:p>
+      <w:pPr>
+        <w:numPr>
+          <w:ilvl w:val="0"/>
+          <w:numId w:val="1005"/>
+        </w:numPr>
+        <w:pStyle w:val="Compact"/>
+      </w:pPr>
+      <w:r>
+        <w:rPr>
+          <w:rStyle w:val="VerbatimChar"/>
+        </w:rPr>
+        <w:t xml:space="preserve">export_manager.render_template(name, context, *, out_path=None)</w:t>
+      </w:r>
+    </w:p>
+    <w:p>
+      <w:pPr>
+        <w:numPr>
+          <w:ilvl w:val="0"/>
+          <w:numId w:val="1005"/>
+        </w:numPr>
+        <w:pStyle w:val="Compact"/>
+      </w:pPr>
+      <w:r>
+        <w:rPr>
+          <w:rStyle w:val="VerbatimChar"/>
+        </w:rPr>
+        <w:t xml:space="preserve">excel_export_enhanced.build_enhanced_workbook(schedule_df, groups_df, *, kpi, solver_stats, options, color_scheme, semester)</w:t>
+      </w:r>
+    </w:p>
+    <w:p>
+      <w:pPr>
+        <w:numPr>
+          <w:ilvl w:val="0"/>
+          <w:numId w:val="1005"/>
+        </w:numPr>
+        <w:pStyle w:val="Compact"/>
+      </w:pPr>
+      <w:r>
+        <w:rPr>
+          <w:rStyle w:val="VerbatimChar"/>
+        </w:rPr>
+        <w:t xml:space="preserve">excel_export_enhanced.export_enhanced(semester=None, *, out_path=None, options=None, color_scheme='loyola')</w:t>
+      </w:r>
+    </w:p>
+    <w:p>
+      <w:pPr>
+        <w:pStyle w:val="FirstParagraph"/>
+      </w:pPr>
+      <w:r>
+        <w:t xml:space="preserve">Room capacity for cell comments is a documented proxy (max students ever</w:t>
+      </w:r>
+      <w:r>
+        <w:t xml:space="preserve"> </w:t>
+      </w:r>
+      <w:r>
+        <w:t xml:space="preserve">scheduled in a room) because the pipeline outputs carry no explicit capacity.</w:t>
+      </w:r>
+    </w:p>
+    <w:p>
+      <w:pPr>
+        <w:pStyle w:val="BodyText"/>
+      </w:pPr>
+      <w:r>
+        <w:t xml:space="preserve">See</w:t>
+      </w:r>
+      <w:r>
+        <w:t xml:space="preserve"> </w:t>
+      </w:r>
+      <w:r>
+        <w:rPr>
+          <w:rStyle w:val="VerbatimChar"/>
+        </w:rPr>
+        <w:t xml:space="preserve">PHASE3_EXCEL_FEATURES.md</w:t>
+      </w:r>
+      <w:r>
+        <w:t xml:space="preserve"> </w:t>
+      </w:r>
+      <w:r>
+        <w:t xml:space="preserve">for usage details.</w:t>
+      </w:r>
+    </w:p>
+    <w:bookmarkEnd w:id="44"/>
+    <w:bookmarkEnd w:id="45"/>
+    <w:bookmarkEnd w:id="46"/>
     <w:sectPr/>
   </w:body>
 </w:document>
@@ -5891,6 +6977,9 @@
     <w:lvlOverride w:ilvl="8">
       <w:startOverride w:val="1"/>
     </w:lvlOverride>
+  </w:num>
+  <w:num w:numId="1005">
+    <w:abstractNumId w:val="991"/>
   </w:num>
 </w:numbering>
 </file>

</xml_diff>